<commit_message>
Versión con Mejoras para la visualización de los demas docentes
</commit_message>
<xml_diff>
--- a/public/assets/docs/Patrocinio.docx
+++ b/public/assets/docs/Patrocinio.docx
@@ -18,15 +18,15 @@
         <mc:AlternateContent>
           <mc:Choice Requires="wps">
             <w:drawing>
-              <wp:anchor distT="0" distB="0" distL="114300" distR="114300" simplePos="0" relativeHeight="251659264" behindDoc="0" locked="1" layoutInCell="1" allowOverlap="0" wp14:anchorId="5B3F9792" wp14:editId="2AD79951">
+              <wp:anchor distT="0" distB="0" distL="114300" distR="114300" simplePos="0" relativeHeight="251659264" behindDoc="0" locked="1" layoutInCell="1" allowOverlap="0" wp14:anchorId="5B3F9792" wp14:editId="5C1728CA">
                 <wp:simplePos x="0" y="0"/>
                 <wp:positionH relativeFrom="page">
-                  <wp:align>center</wp:align>
+                  <wp:align>left</wp:align>
                 </wp:positionH>
                 <wp:positionV relativeFrom="margin">
                   <wp:posOffset>-360045</wp:posOffset>
                 </wp:positionV>
-                <wp:extent cx="7560000" cy="1620000"/>
+                <wp:extent cx="7559675" cy="1828800"/>
                 <wp:effectExtent l="0" t="0" r="3175" b="0"/>
                 <wp:wrapNone/>
                 <wp:docPr id="491564969" name="ctc1"/>
@@ -38,7 +38,7 @@
                       <wps:spPr>
                         <a:xfrm>
                           <a:off x="0" y="0"/>
-                          <a:ext cx="7560000" cy="1620000"/>
+                          <a:ext cx="7559675" cy="1828800"/>
                         </a:xfrm>
                         <a:prstGeom prst="rect">
                           <a:avLst/>
@@ -260,7 +260,7 @@
                             <w:tr>
                               <w:trPr>
                                 <w:cantSplit/>
-                                <w:trHeight w:val="1200"/>
+                                <w:trHeight w:val="1951"/>
                                 <w:jc w:val="center"/>
                               </w:trPr>
                               <w:tc>
@@ -499,7 +499,7 @@
                 <v:stroke joinstyle="miter"/>
                 <v:path gradientshapeok="t" o:connecttype="rect"/>
               </v:shapetype>
-              <v:shape id="ctc1" o:spid="_x0000_s1026" type="#_x0000_t202" style="position:absolute;margin-left:0;margin-top:-28.35pt;width:595.3pt;height:127.55pt;z-index:251659264;visibility:visible;mso-wrap-style:square;mso-width-percent:0;mso-height-percent:0;mso-wrap-distance-left:9pt;mso-wrap-distance-top:0;mso-wrap-distance-right:9pt;mso-wrap-distance-bottom:0;mso-position-horizontal:center;mso-position-horizontal-relative:page;mso-position-vertical:absolute;mso-position-vertical-relative:margin;mso-width-percent:0;mso-height-percent:0;mso-width-relative:margin;mso-height-relative:margin;v-text-anchor:top" o:gfxdata="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" o:allowoverlap="f" fillcolor="white [3201]" stroked="f" strokeweight=".5pt">
+              <v:shape id="ctc1" o:spid="_x0000_s1026" type="#_x0000_t202" style="position:absolute;margin-left:0;margin-top:-28.35pt;width:595.25pt;height:2in;z-index:251659264;visibility:visible;mso-wrap-style:square;mso-width-percent:0;mso-height-percent:0;mso-wrap-distance-left:9pt;mso-wrap-distance-top:0;mso-wrap-distance-right:9pt;mso-wrap-distance-bottom:0;mso-position-horizontal:left;mso-position-horizontal-relative:page;mso-position-vertical:absolute;mso-position-vertical-relative:margin;mso-width-percent:0;mso-height-percent:0;mso-width-relative:margin;mso-height-relative:margin;v-text-anchor:top" o:gfxdata="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" o:allowoverlap="f" fillcolor="white [3201]" stroked="f" strokeweight=".5pt">
                 <v:textbox>
                   <w:txbxContent>
                     <w:tbl>
@@ -701,7 +701,7 @@
                       <w:tr>
                         <w:trPr>
                           <w:cantSplit/>
-                          <w:trHeight w:val="1200"/>
+                          <w:trHeight w:val="1951"/>
                           <w:jc w:val="center"/>
                         </w:trPr>
                         <w:tc>
@@ -1175,7 +1175,7 @@
                                       <w:sz w:val="18"/>
                                       <w:szCs w:val="18"/>
                                     </w:rPr>
-                                    <w:t>ELABORADO</w:t>
+                                    <w:t>Elaborado</w:t>
                                   </w:r>
                                   <w:r>
                                     <w:rPr>
@@ -1192,7 +1192,7 @@
                                       <w:sz w:val="18"/>
                                       <w:szCs w:val="18"/>
                                     </w:rPr>
-                                    <w:t>POR:</w:t>
+                                    <w:t>Por:</w:t>
                                   </w:r>
                                 </w:p>
                                 <w:p>
@@ -1267,7 +1267,7 @@
                                       <w:sz w:val="18"/>
                                       <w:szCs w:val="18"/>
                                     </w:rPr>
-                                    <w:t>APROBADO</w:t>
+                                    <w:t>Aprobado</w:t>
                                   </w:r>
                                   <w:r>
                                     <w:rPr>
@@ -1284,7 +1284,7 @@
                                       <w:sz w:val="18"/>
                                       <w:szCs w:val="18"/>
                                     </w:rPr>
-                                    <w:t>POR:</w:t>
+                                    <w:t>Por:</w:t>
                                   </w:r>
                                 </w:p>
                               </w:tc>
@@ -1397,6 +1397,7 @@
                                     </w:rPr>
                                     <w:t xml:space="preserve"> </w:t>
                                   </w:r>
+                                  <w:proofErr w:type="spellStart"/>
                                   <w:r>
                                     <w:rPr>
                                       <w:rFonts w:ascii="Arial" w:hAnsi="Arial" w:cs="Arial"/>
@@ -1405,7 +1406,18 @@
                                       <w:sz w:val="18"/>
                                       <w:szCs w:val="18"/>
                                     </w:rPr>
-                                    <w:t>Alex León Tito</w:t>
+                                    <w:t>Msc</w:t>
+                                  </w:r>
+                                  <w:proofErr w:type="spellEnd"/>
+                                  <w:r>
+                                    <w:rPr>
+                                      <w:rFonts w:ascii="Arial" w:hAnsi="Arial" w:cs="Arial"/>
+                                      <w:b/>
+                                      <w:spacing w:val="-1"/>
+                                      <w:sz w:val="18"/>
+                                      <w:szCs w:val="18"/>
+                                    </w:rPr>
+                                    <w:t>. Jefferson Villarreal</w:t>
                                   </w:r>
                                 </w:p>
                               </w:tc>
@@ -1443,7 +1455,6 @@
                                     </w:rPr>
                                     <w:t xml:space="preserve"> </w:t>
                                   </w:r>
-                                  <w:proofErr w:type="spellStart"/>
                                   <w:r>
                                     <w:rPr>
                                       <w:rFonts w:ascii="Arial" w:hAnsi="Arial" w:cs="Arial"/>
@@ -1452,18 +1463,7 @@
                                       <w:sz w:val="18"/>
                                       <w:szCs w:val="18"/>
                                     </w:rPr>
-                                    <w:t>Msc</w:t>
-                                  </w:r>
-                                  <w:proofErr w:type="spellEnd"/>
-                                  <w:r>
-                                    <w:rPr>
-                                      <w:rFonts w:ascii="Arial" w:hAnsi="Arial" w:cs="Arial"/>
-                                      <w:b/>
-                                      <w:spacing w:val="-1"/>
-                                      <w:sz w:val="18"/>
-                                      <w:szCs w:val="18"/>
-                                    </w:rPr>
-                                    <w:t>. Jefferson Villarreal</w:t>
+                                    <w:t>Alex León Tito</w:t>
                                   </w:r>
                                 </w:p>
                               </w:tc>
@@ -1575,7 +1575,34 @@
                                       <w:spacing w:val="-2"/>
                                       <w:sz w:val="18"/>
                                     </w:rPr>
-                                    <w:t>Vicerrector</w:t>
+                                    <w:t xml:space="preserve">Gestor de </w:t>
+                                  </w:r>
+                                  <w:r>
+                                    <w:rPr>
+                                      <w:rFonts w:ascii="Arial"/>
+                                      <w:b/>
+                                      <w:spacing w:val="-2"/>
+                                      <w:sz w:val="18"/>
+                                    </w:rPr>
+                                    <w:t>Procesos Acad</w:t>
+                                  </w:r>
+                                  <w:r>
+                                    <w:rPr>
+                                      <w:rFonts w:ascii="Arial"/>
+                                      <w:b/>
+                                      <w:spacing w:val="-2"/>
+                                      <w:sz w:val="18"/>
+                                    </w:rPr>
+                                    <w:t>é</w:t>
+                                  </w:r>
+                                  <w:r>
+                                    <w:rPr>
+                                      <w:rFonts w:ascii="Arial"/>
+                                      <w:b/>
+                                      <w:spacing w:val="-2"/>
+                                      <w:sz w:val="18"/>
+                                    </w:rPr>
+                                    <w:t>micos</w:t>
                                   </w:r>
                                 </w:p>
                               </w:tc>
@@ -1620,7 +1647,7 @@
                                       <w:spacing w:val="-2"/>
                                       <w:sz w:val="18"/>
                                     </w:rPr>
-                                    <w:t>Gestor de Carreras</w:t>
+                                    <w:t>Vicerrector</w:t>
                                   </w:r>
                                 </w:p>
                               </w:tc>
@@ -1701,7 +1728,7 @@
                                 <w:sz w:val="18"/>
                                 <w:szCs w:val="18"/>
                               </w:rPr>
-                              <w:t>ELABORADO</w:t>
+                              <w:t>Elaborado</w:t>
                             </w:r>
                             <w:r>
                               <w:rPr>
@@ -1718,7 +1745,7 @@
                                 <w:sz w:val="18"/>
                                 <w:szCs w:val="18"/>
                               </w:rPr>
-                              <w:t>POR:</w:t>
+                              <w:t>Por:</w:t>
                             </w:r>
                           </w:p>
                           <w:p>
@@ -1793,7 +1820,7 @@
                                 <w:sz w:val="18"/>
                                 <w:szCs w:val="18"/>
                               </w:rPr>
-                              <w:t>APROBADO</w:t>
+                              <w:t>Aprobado</w:t>
                             </w:r>
                             <w:r>
                               <w:rPr>
@@ -1810,7 +1837,7 @@
                                 <w:sz w:val="18"/>
                                 <w:szCs w:val="18"/>
                               </w:rPr>
-                              <w:t>POR:</w:t>
+                              <w:t>Por:</w:t>
                             </w:r>
                           </w:p>
                         </w:tc>
@@ -1923,6 +1950,7 @@
                               </w:rPr>
                               <w:t xml:space="preserve"> </w:t>
                             </w:r>
+                            <w:proofErr w:type="spellStart"/>
                             <w:r>
                               <w:rPr>
                                 <w:rFonts w:ascii="Arial" w:hAnsi="Arial" w:cs="Arial"/>
@@ -1931,7 +1959,18 @@
                                 <w:sz w:val="18"/>
                                 <w:szCs w:val="18"/>
                               </w:rPr>
-                              <w:t>Alex León Tito</w:t>
+                              <w:t>Msc</w:t>
+                            </w:r>
+                            <w:proofErr w:type="spellEnd"/>
+                            <w:r>
+                              <w:rPr>
+                                <w:rFonts w:ascii="Arial" w:hAnsi="Arial" w:cs="Arial"/>
+                                <w:b/>
+                                <w:spacing w:val="-1"/>
+                                <w:sz w:val="18"/>
+                                <w:szCs w:val="18"/>
+                              </w:rPr>
+                              <w:t>. Jefferson Villarreal</w:t>
                             </w:r>
                           </w:p>
                         </w:tc>
@@ -1969,7 +2008,6 @@
                               </w:rPr>
                               <w:t xml:space="preserve"> </w:t>
                             </w:r>
-                            <w:proofErr w:type="spellStart"/>
                             <w:r>
                               <w:rPr>
                                 <w:rFonts w:ascii="Arial" w:hAnsi="Arial" w:cs="Arial"/>
@@ -1978,18 +2016,7 @@
                                 <w:sz w:val="18"/>
                                 <w:szCs w:val="18"/>
                               </w:rPr>
-                              <w:t>Msc</w:t>
-                            </w:r>
-                            <w:proofErr w:type="spellEnd"/>
-                            <w:r>
-                              <w:rPr>
-                                <w:rFonts w:ascii="Arial" w:hAnsi="Arial" w:cs="Arial"/>
-                                <w:b/>
-                                <w:spacing w:val="-1"/>
-                                <w:sz w:val="18"/>
-                                <w:szCs w:val="18"/>
-                              </w:rPr>
-                              <w:t>. Jefferson Villarreal</w:t>
+                              <w:t>Alex León Tito</w:t>
                             </w:r>
                           </w:p>
                         </w:tc>
@@ -2101,7 +2128,34 @@
                                 <w:spacing w:val="-2"/>
                                 <w:sz w:val="18"/>
                               </w:rPr>
-                              <w:t>Vicerrector</w:t>
+                              <w:t xml:space="preserve">Gestor de </w:t>
+                            </w:r>
+                            <w:r>
+                              <w:rPr>
+                                <w:rFonts w:ascii="Arial"/>
+                                <w:b/>
+                                <w:spacing w:val="-2"/>
+                                <w:sz w:val="18"/>
+                              </w:rPr>
+                              <w:t>Procesos Acad</w:t>
+                            </w:r>
+                            <w:r>
+                              <w:rPr>
+                                <w:rFonts w:ascii="Arial"/>
+                                <w:b/>
+                                <w:spacing w:val="-2"/>
+                                <w:sz w:val="18"/>
+                              </w:rPr>
+                              <w:t>é</w:t>
+                            </w:r>
+                            <w:r>
+                              <w:rPr>
+                                <w:rFonts w:ascii="Arial"/>
+                                <w:b/>
+                                <w:spacing w:val="-2"/>
+                                <w:sz w:val="18"/>
+                              </w:rPr>
+                              <w:t>micos</w:t>
                             </w:r>
                           </w:p>
                         </w:tc>
@@ -2146,7 +2200,7 @@
                                 <w:spacing w:val="-2"/>
                                 <w:sz w:val="18"/>
                               </w:rPr>
-                              <w:t>Gestor de Carreras</w:t>
+                              <w:t>Vicerrector</w:t>
                             </w:r>
                           </w:p>
                         </w:tc>
@@ -2174,20 +2228,28 @@
     </w:p>
     <w:p>
       <w:pPr>
-        <w:jc w:val="center"/>
         <w:rPr>
           <w:rFonts w:ascii="Arial" w:hAnsi="Arial" w:cs="Arial"/>
           <w:b/>
           <w:bCs/>
         </w:rPr>
       </w:pPr>
-      <w:r>
+    </w:p>
+    <w:p>
+      <w:pPr>
+        <w:jc w:val="center"/>
         <w:rPr>
           <w:rFonts w:ascii="Arial" w:hAnsi="Arial" w:cs="Arial"/>
           <w:b/>
           <w:bCs/>
         </w:rPr>
-        <w:lastRenderedPageBreak/>
+      </w:pPr>
+      <w:r>
+        <w:rPr>
+          <w:rFonts w:ascii="Arial" w:hAnsi="Arial" w:cs="Arial"/>
+          <w:b/>
+          <w:bCs/>
+        </w:rPr>
         <w:t>Acuerdo De Patrocinio Institucional</w:t>
       </w:r>
     </w:p>
@@ -2826,21 +2888,7 @@
         <w:rPr>
           <w:rFonts w:ascii="Arial" w:hAnsi="Arial" w:cs="Arial"/>
         </w:rPr>
-        <w:t xml:space="preserve"> Participar en la capacitación, cumpliendo con los requisitos establecidos por el proveedor de </w:t>
-      </w:r>
-      <w:proofErr w:type="gramStart"/>
-      <w:r>
-        <w:rPr>
-          <w:rFonts w:ascii="Arial" w:hAnsi="Arial" w:cs="Arial"/>
-        </w:rPr>
-        <w:t>la misma</w:t>
-      </w:r>
-      <w:proofErr w:type="gramEnd"/>
-      <w:r>
-        <w:rPr>
-          <w:rFonts w:ascii="Arial" w:hAnsi="Arial" w:cs="Arial"/>
-        </w:rPr>
-        <w:t>, y presentar los certificados de aprobación correspondientes al ITSQMET.</w:t>
+        <w:t xml:space="preserve"> Participar en la capacitación, cumpliendo con los requisitos establecidos por el proveedor de la misma, y presentar los certificados de aprobación correspondientes al ITSQMET.</w:t>
       </w:r>
     </w:p>
     <w:p>
@@ -3010,27 +3058,7 @@
         <w:rPr>
           <w:rFonts w:ascii="Arial" w:hAnsi="Arial" w:cs="Arial"/>
         </w:rPr>
-        <w:t xml:space="preserve">El presente acuerdo </w:t>
-      </w:r>
-      <w:proofErr w:type="gramStart"/>
-      <w:r>
-        <w:rPr>
-          <w:rFonts w:ascii="Arial" w:hAnsi="Arial" w:cs="Arial"/>
-        </w:rPr>
-        <w:t>entrará en vigencia</w:t>
-      </w:r>
-      <w:proofErr w:type="gramEnd"/>
-      <w:r>
-        <w:rPr>
-          <w:rFonts w:ascii="Arial" w:hAnsi="Arial" w:cs="Arial"/>
-        </w:rPr>
-        <w:t xml:space="preserve"> una vez firmado por ambas partes y se mantendrá válido hasta el cumplimiento total de las obligaciones aquí establecidas</w:t>
-      </w:r>
-      <w:r>
-        <w:rPr>
-          <w:rFonts w:ascii="Arial" w:hAnsi="Arial" w:cs="Arial"/>
-        </w:rPr>
-        <w:t>.</w:t>
+        <w:t>El presente acuerdo entrará en vigencia una vez firmado por ambas partes y se mantendrá válido hasta el cumplimiento total de las obligaciones aquí establecidas.</w:t>
       </w:r>
     </w:p>
     <w:p>
@@ -4209,16 +4237,16 @@
       </w:rPr>
     </w:lvl>
   </w:abstractNum>
-  <w:num w:numId="1" w16cid:durableId="1424061733">
+  <w:num w:numId="1" w16cid:durableId="1688865446">
     <w:abstractNumId w:val="2"/>
   </w:num>
-  <w:num w:numId="2" w16cid:durableId="1874810086">
+  <w:num w:numId="2" w16cid:durableId="1305963706">
     <w:abstractNumId w:val="3"/>
   </w:num>
-  <w:num w:numId="3" w16cid:durableId="860977332">
+  <w:num w:numId="3" w16cid:durableId="2098624212">
     <w:abstractNumId w:val="1"/>
   </w:num>
-  <w:num w:numId="4" w16cid:durableId="26295759">
+  <w:num w:numId="4" w16cid:durableId="9993079">
     <w:abstractNumId w:val="0"/>
   </w:num>
 </w:numbering>

</xml_diff>